<commit_message>
Updated file with new questions
</commit_message>
<xml_diff>
--- a/KCC Interview Prep.docx
+++ b/KCC Interview Prep.docx
@@ -20,7 +20,7 @@
       <w:pPr>
         <w:numPr>
           <w:ilvl w:val="0"/>
-          <w:numId w:val="1"/>
+          <w:numId w:val="5"/>
         </w:numPr>
         <w:ind w:left="720" w:hanging="360"/>
         <w:rPr/>
@@ -42,7 +42,7 @@
       <w:pPr>
         <w:numPr>
           <w:ilvl w:val="1"/>
-          <w:numId w:val="1"/>
+          <w:numId w:val="5"/>
         </w:numPr>
         <w:ind w:left="1440" w:hanging="360"/>
         <w:rPr/>
@@ -58,7 +58,7 @@
       <w:pPr>
         <w:numPr>
           <w:ilvl w:val="1"/>
-          <w:numId w:val="1"/>
+          <w:numId w:val="5"/>
         </w:numPr>
         <w:ind w:left="1440" w:hanging="360"/>
         <w:rPr/>
@@ -74,7 +74,7 @@
       <w:pPr>
         <w:numPr>
           <w:ilvl w:val="0"/>
-          <w:numId w:val="1"/>
+          <w:numId w:val="5"/>
         </w:numPr>
         <w:ind w:left="720" w:hanging="360"/>
         <w:rPr/>
@@ -96,7 +96,7 @@
       <w:pPr>
         <w:numPr>
           <w:ilvl w:val="1"/>
-          <w:numId w:val="1"/>
+          <w:numId w:val="5"/>
         </w:numPr>
         <w:ind w:left="1440" w:hanging="360"/>
         <w:rPr/>
@@ -112,7 +112,7 @@
       <w:pPr>
         <w:numPr>
           <w:ilvl w:val="0"/>
-          <w:numId w:val="1"/>
+          <w:numId w:val="5"/>
         </w:numPr>
         <w:ind w:left="720" w:hanging="360"/>
         <w:rPr/>
@@ -134,7 +134,7 @@
       <w:pPr>
         <w:numPr>
           <w:ilvl w:val="0"/>
-          <w:numId w:val="1"/>
+          <w:numId w:val="5"/>
         </w:numPr>
         <w:ind w:left="720" w:hanging="360"/>
         <w:rPr/>
@@ -156,7 +156,7 @@
       <w:pPr>
         <w:numPr>
           <w:ilvl w:val="1"/>
-          <w:numId w:val="1"/>
+          <w:numId w:val="5"/>
         </w:numPr>
         <w:ind w:left="1440" w:hanging="360"/>
         <w:rPr/>
@@ -172,7 +172,7 @@
       <w:pPr>
         <w:numPr>
           <w:ilvl w:val="0"/>
-          <w:numId w:val="1"/>
+          <w:numId w:val="5"/>
         </w:numPr>
         <w:ind w:left="720" w:hanging="360"/>
         <w:rPr/>
@@ -194,22 +194,15 @@
       <w:pPr>
         <w:numPr>
           <w:ilvl w:val="0"/>
-          <w:numId w:val="1"/>
-        </w:numPr>
-        <w:ind w:left="720" w:hanging="360"/>
-        <w:rPr/>
-      </w:pPr>
-      <w:r>
-        <w:rPr>
-          <w:b w:val="1"/>
+          <w:numId w:val="5"/>
+        </w:numPr>
+        <w:ind w:left="720" w:hanging="360"/>
+      </w:pPr>
+      <w:r>
+        <w:rPr>
           <w:rtl w:val="0"/>
         </w:rPr>
         <w:t xml:space="preserve">Parameters required to connect in Linked Services:</w:t>
-      </w:r>
-      <w:r>
-        <w:rPr>
-          <w:rtl w:val="0"/>
-        </w:rPr>
         <w:br w:type="textWrapping"/>
         <w:t xml:space="preserve">a) API</w:t>
         <w:br w:type="textWrapping"/>
@@ -217,12 +210,17 @@
         <w:br w:type="textWrapping"/>
         <w:t xml:space="preserve">c) SFTP</w:t>
       </w:r>
-    </w:p>
-    <w:p>
-      <w:pPr>
-        <w:numPr>
-          <w:ilvl w:val="0"/>
-          <w:numId w:val="1"/>
+      <w:r>
+        <w:rPr>
+          <w:rtl w:val="0"/>
+        </w:rPr>
+      </w:r>
+    </w:p>
+    <w:p>
+      <w:pPr>
+        <w:numPr>
+          <w:ilvl w:val="0"/>
+          <w:numId w:val="5"/>
         </w:numPr>
         <w:ind w:left="720" w:hanging="360"/>
         <w:rPr/>
@@ -244,7 +242,7 @@
       <w:pPr>
         <w:numPr>
           <w:ilvl w:val="0"/>
-          <w:numId w:val="1"/>
+          <w:numId w:val="5"/>
         </w:numPr>
         <w:ind w:left="720" w:hanging="360"/>
         <w:rPr/>
@@ -261,7 +259,7 @@
       <w:pPr>
         <w:numPr>
           <w:ilvl w:val="0"/>
-          <w:numId w:val="1"/>
+          <w:numId w:val="5"/>
         </w:numPr>
         <w:ind w:left="720" w:hanging="360"/>
         <w:rPr>
@@ -310,7 +308,7 @@
       <w:pPr>
         <w:numPr>
           <w:ilvl w:val="0"/>
-          <w:numId w:val="2"/>
+          <w:numId w:val="6"/>
         </w:numPr>
         <w:ind w:left="720" w:hanging="360"/>
         <w:rPr/>
@@ -332,7 +330,7 @@
       <w:pPr>
         <w:numPr>
           <w:ilvl w:val="0"/>
-          <w:numId w:val="2"/>
+          <w:numId w:val="6"/>
         </w:numPr>
         <w:ind w:left="720" w:hanging="360"/>
         <w:rPr/>
@@ -354,7 +352,7 @@
       <w:pPr>
         <w:numPr>
           <w:ilvl w:val="1"/>
-          <w:numId w:val="2"/>
+          <w:numId w:val="6"/>
         </w:numPr>
         <w:ind w:left="1440" w:hanging="360"/>
         <w:rPr/>
@@ -370,7 +368,7 @@
       <w:pPr>
         <w:numPr>
           <w:ilvl w:val="1"/>
-          <w:numId w:val="2"/>
+          <w:numId w:val="6"/>
         </w:numPr>
         <w:ind w:left="1440" w:hanging="360"/>
         <w:rPr/>
@@ -386,7 +384,7 @@
       <w:pPr>
         <w:numPr>
           <w:ilvl w:val="1"/>
-          <w:numId w:val="2"/>
+          <w:numId w:val="6"/>
         </w:numPr>
         <w:ind w:left="1440" w:hanging="360"/>
         <w:rPr/>
@@ -402,7 +400,7 @@
       <w:pPr>
         <w:numPr>
           <w:ilvl w:val="0"/>
-          <w:numId w:val="2"/>
+          <w:numId w:val="6"/>
         </w:numPr>
         <w:ind w:left="720" w:hanging="360"/>
         <w:rPr/>
@@ -424,7 +422,7 @@
       <w:pPr>
         <w:numPr>
           <w:ilvl w:val="0"/>
-          <w:numId w:val="2"/>
+          <w:numId w:val="6"/>
         </w:numPr>
         <w:ind w:left="720" w:hanging="360"/>
         <w:rPr/>
@@ -446,7 +444,7 @@
       <w:pPr>
         <w:numPr>
           <w:ilvl w:val="1"/>
-          <w:numId w:val="2"/>
+          <w:numId w:val="6"/>
         </w:numPr>
         <w:ind w:left="1440" w:hanging="360"/>
         <w:rPr/>
@@ -462,7 +460,7 @@
       <w:pPr>
         <w:numPr>
           <w:ilvl w:val="0"/>
-          <w:numId w:val="2"/>
+          <w:numId w:val="6"/>
         </w:numPr>
         <w:ind w:left="720" w:hanging="360"/>
         <w:rPr/>
@@ -484,7 +482,7 @@
       <w:pPr>
         <w:numPr>
           <w:ilvl w:val="0"/>
-          <w:numId w:val="2"/>
+          <w:numId w:val="6"/>
         </w:numPr>
         <w:ind w:left="720" w:hanging="360"/>
         <w:rPr/>
@@ -506,7 +504,7 @@
       <w:pPr>
         <w:numPr>
           <w:ilvl w:val="0"/>
-          <w:numId w:val="2"/>
+          <w:numId w:val="6"/>
         </w:numPr>
         <w:ind w:left="720" w:hanging="360"/>
         <w:rPr/>
@@ -523,7 +521,7 @@
       <w:pPr>
         <w:numPr>
           <w:ilvl w:val="0"/>
-          <w:numId w:val="2"/>
+          <w:numId w:val="6"/>
         </w:numPr>
         <w:ind w:left="720" w:hanging="360"/>
         <w:rPr>
@@ -543,7 +541,7 @@
       <w:pPr>
         <w:numPr>
           <w:ilvl w:val="0"/>
-          <w:numId w:val="2"/>
+          <w:numId w:val="6"/>
         </w:numPr>
         <w:ind w:left="720" w:hanging="360"/>
         <w:rPr>
@@ -1092,6 +1090,1603 @@
     <w:p>
       <w:pPr>
         <w:rPr/>
+      </w:pPr>
+      <w:r>
+        <w:rPr>
+          <w:rtl w:val="0"/>
+        </w:rPr>
+      </w:r>
+    </w:p>
+    <w:p>
+      <w:pPr>
+        <w:rPr>
+          <w:b w:val="1"/>
+        </w:rPr>
+      </w:pPr>
+      <w:r>
+        <w:rPr>
+          <w:b w:val="1"/>
+          <w:rtl w:val="0"/>
+        </w:rPr>
+        <w:t xml:space="preserve">[Sruthi Sri S C]: KC Client Interview Questions</w:t>
+      </w:r>
+    </w:p>
+    <w:p>
+      <w:pPr>
+        <w:numPr>
+          <w:ilvl w:val="0"/>
+          <w:numId w:val="3"/>
+        </w:numPr>
+        <w:spacing w:after="0" w:afterAutospacing="0"/>
+        <w:ind w:left="720" w:hanging="360"/>
+        <w:rPr>
+          <w:u w:val="none"/>
+        </w:rPr>
+      </w:pPr>
+      <w:r>
+        <w:rPr>
+          <w:rtl w:val="0"/>
+        </w:rPr>
+        <w:t xml:space="preserve">Describe your projects and questions on your role in it</w:t>
+      </w:r>
+    </w:p>
+    <w:p>
+      <w:pPr>
+        <w:numPr>
+          <w:ilvl w:val="0"/>
+          <w:numId w:val="3"/>
+        </w:numPr>
+        <w:spacing w:after="0" w:afterAutospacing="0"/>
+        <w:ind w:left="720" w:hanging="360"/>
+        <w:rPr>
+          <w:u w:val="none"/>
+        </w:rPr>
+      </w:pPr>
+      <w:r>
+        <w:rPr>
+          <w:rtl w:val="0"/>
+        </w:rPr>
+        <w:t xml:space="preserve">Elaborate on ADF Project you worked on </w:t>
+      </w:r>
+    </w:p>
+    <w:p>
+      <w:pPr>
+        <w:numPr>
+          <w:ilvl w:val="0"/>
+          <w:numId w:val="3"/>
+        </w:numPr>
+        <w:spacing w:after="0" w:afterAutospacing="0"/>
+        <w:ind w:left="720" w:hanging="360"/>
+        <w:rPr>
+          <w:u w:val="none"/>
+        </w:rPr>
+      </w:pPr>
+      <w:r>
+        <w:rPr>
+          <w:rtl w:val="0"/>
+        </w:rPr>
+        <w:t xml:space="preserve">How did you handle files from different schemas and how did you load in to snowflake</w:t>
+      </w:r>
+    </w:p>
+    <w:p>
+      <w:pPr>
+        <w:numPr>
+          <w:ilvl w:val="0"/>
+          <w:numId w:val="3"/>
+        </w:numPr>
+        <w:spacing w:after="0" w:afterAutospacing="0"/>
+        <w:ind w:left="720" w:hanging="360"/>
+        <w:rPr>
+          <w:u w:val="none"/>
+        </w:rPr>
+      </w:pPr>
+      <w:r>
+        <w:rPr>
+          <w:rtl w:val="0"/>
+        </w:rPr>
+        <w:t xml:space="preserve">Data flow </w:t>
+      </w:r>
+    </w:p>
+    <w:p>
+      <w:pPr>
+        <w:numPr>
+          <w:ilvl w:val="0"/>
+          <w:numId w:val="3"/>
+        </w:numPr>
+        <w:spacing w:after="0" w:afterAutospacing="0"/>
+        <w:ind w:left="720" w:hanging="360"/>
+        <w:rPr>
+          <w:u w:val="none"/>
+        </w:rPr>
+      </w:pPr>
+      <w:r>
+        <w:rPr>
+          <w:rtl w:val="0"/>
+        </w:rPr>
+        <w:t xml:space="preserve">Linked service to connect to snowflake </w:t>
+      </w:r>
+    </w:p>
+    <w:p>
+      <w:pPr>
+        <w:numPr>
+          <w:ilvl w:val="0"/>
+          <w:numId w:val="3"/>
+        </w:numPr>
+        <w:spacing w:after="0" w:afterAutospacing="0"/>
+        <w:ind w:left="720" w:hanging="360"/>
+        <w:rPr>
+          <w:u w:val="none"/>
+        </w:rPr>
+      </w:pPr>
+      <w:r>
+        <w:rPr>
+          <w:rtl w:val="0"/>
+        </w:rPr>
+        <w:t xml:space="preserve">how do you export files to snowflake stage </w:t>
+      </w:r>
+    </w:p>
+    <w:p>
+      <w:pPr>
+        <w:numPr>
+          <w:ilvl w:val="0"/>
+          <w:numId w:val="3"/>
+        </w:numPr>
+        <w:spacing w:after="0" w:afterAutospacing="0"/>
+        <w:ind w:left="720" w:hanging="360"/>
+        <w:rPr>
+          <w:u w:val="none"/>
+        </w:rPr>
+      </w:pPr>
+      <w:r>
+        <w:rPr>
+          <w:rtl w:val="0"/>
+        </w:rPr>
+        <w:t xml:space="preserve">snowflake related scenario based questions</w:t>
+      </w:r>
+    </w:p>
+    <w:p>
+      <w:pPr>
+        <w:numPr>
+          <w:ilvl w:val="0"/>
+          <w:numId w:val="3"/>
+        </w:numPr>
+        <w:spacing w:after="0" w:afterAutospacing="0"/>
+        <w:ind w:left="720" w:hanging="360"/>
+        <w:rPr>
+          <w:u w:val="none"/>
+        </w:rPr>
+      </w:pPr>
+      <w:r>
+        <w:rPr>
+          <w:rtl w:val="0"/>
+        </w:rPr>
+        <w:t xml:space="preserve">types of linked service</w:t>
+      </w:r>
+    </w:p>
+    <w:p>
+      <w:pPr>
+        <w:numPr>
+          <w:ilvl w:val="0"/>
+          <w:numId w:val="3"/>
+        </w:numPr>
+        <w:ind w:left="720" w:hanging="360"/>
+      </w:pPr>
+      <w:r>
+        <w:rPr>
+          <w:rtl w:val="0"/>
+        </w:rPr>
+        <w:t xml:space="preserve"> Optimization you did in Snowflake procedures</w:t>
+      </w:r>
+    </w:p>
+    <w:p>
+      <w:pPr>
+        <w:ind w:left="720" w:firstLine="0"/>
+        <w:rPr/>
+      </w:pPr>
+      <w:r>
+        <w:rPr>
+          <w:rtl w:val="0"/>
+        </w:rPr>
+      </w:r>
+    </w:p>
+    <w:p>
+      <w:pPr>
+        <w:rPr>
+          <w:b w:val="1"/>
+        </w:rPr>
+      </w:pPr>
+      <w:r>
+        <w:rPr>
+          <w:b w:val="1"/>
+          <w:rtl w:val="0"/>
+        </w:rPr>
+        <w:t xml:space="preserve">[Shubham]: KC Client Interview Questions</w:t>
+      </w:r>
+    </w:p>
+    <w:p>
+      <w:pPr>
+        <w:rPr/>
+      </w:pPr>
+      <w:r>
+        <w:rPr>
+          <w:rtl w:val="0"/>
+        </w:rPr>
+        <w:t xml:space="preserve">1. Explain the project where you used ADF.</w:t>
+      </w:r>
+    </w:p>
+    <w:p>
+      <w:pPr>
+        <w:rPr/>
+      </w:pPr>
+      <w:r>
+        <w:rPr>
+          <w:rtl w:val="0"/>
+        </w:rPr>
+        <w:t xml:space="preserve">2. Optimization you did in Snowflake procedures.</w:t>
+      </w:r>
+    </w:p>
+    <w:p>
+      <w:pPr>
+        <w:rPr/>
+      </w:pPr>
+      <w:r>
+        <w:rPr>
+          <w:rtl w:val="0"/>
+        </w:rPr>
+        <w:t xml:space="preserve">3. Describe how you'd design a delta load process from Oracle to Snowflake for 5 tables via ADF.</w:t>
+      </w:r>
+    </w:p>
+    <w:p>
+      <w:pPr>
+        <w:rPr/>
+      </w:pPr>
+      <w:r>
+        <w:rPr>
+          <w:rtl w:val="0"/>
+        </w:rPr>
+        <w:t xml:space="preserve">4. how to enable delta in oracle using stored procedures</w:t>
+      </w:r>
+    </w:p>
+    <w:p>
+      <w:pPr>
+        <w:rPr/>
+      </w:pPr>
+      <w:r>
+        <w:rPr>
+          <w:rtl w:val="0"/>
+        </w:rPr>
+        <w:t xml:space="preserve">5. What other sources you used in ADF.</w:t>
+      </w:r>
+    </w:p>
+    <w:p>
+      <w:pPr>
+        <w:rPr>
+          <w:b w:val="1"/>
+        </w:rPr>
+      </w:pPr>
+      <w:r>
+        <w:rPr>
+          <w:rtl w:val="0"/>
+        </w:rPr>
+      </w:r>
+    </w:p>
+    <w:p>
+      <w:pPr>
+        <w:ind w:left="720" w:firstLine="0"/>
+        <w:rPr/>
+      </w:pPr>
+      <w:r>
+        <w:rPr>
+          <w:rtl w:val="0"/>
+        </w:rPr>
+      </w:r>
+    </w:p>
+    <w:p>
+      <w:pPr>
+        <w:rPr>
+          <w:b w:val="1"/>
+        </w:rPr>
+      </w:pPr>
+      <w:r>
+        <w:rPr>
+          <w:b w:val="1"/>
+          <w:rtl w:val="0"/>
+        </w:rPr>
+        <w:t xml:space="preserve">[Jayaprasanna]: KC Client Interview Questions</w:t>
+      </w:r>
+    </w:p>
+    <w:p>
+      <w:pPr>
+        <w:numPr>
+          <w:ilvl w:val="0"/>
+          <w:numId w:val="7"/>
+        </w:numPr>
+        <w:spacing w:after="0" w:afterAutospacing="0"/>
+        <w:ind w:left="720" w:hanging="360"/>
+        <w:rPr>
+          <w:u w:val="none"/>
+        </w:rPr>
+      </w:pPr>
+      <w:r>
+        <w:rPr>
+          <w:rtl w:val="0"/>
+        </w:rPr>
+        <w:t xml:space="preserve">Explain the projects you have worked on related to Snowflake performance tuning, and how you identify bottlenecks.</w:t>
+      </w:r>
+    </w:p>
+    <w:p>
+      <w:pPr>
+        <w:numPr>
+          <w:ilvl w:val="0"/>
+          <w:numId w:val="7"/>
+        </w:numPr>
+        <w:spacing w:after="0" w:afterAutospacing="0"/>
+        <w:ind w:left="720" w:hanging="360"/>
+        <w:rPr>
+          <w:u w:val="none"/>
+        </w:rPr>
+      </w:pPr>
+      <w:r>
+        <w:rPr>
+          <w:rtl w:val="0"/>
+        </w:rPr>
+        <w:t xml:space="preserve">Describe how to load multiple source datasets with dependencies using a single stored procedure.</w:t>
+      </w:r>
+    </w:p>
+    <w:p>
+      <w:pPr>
+        <w:numPr>
+          <w:ilvl w:val="0"/>
+          <w:numId w:val="7"/>
+        </w:numPr>
+        <w:spacing w:after="0" w:afterAutospacing="0"/>
+        <w:ind w:left="720" w:hanging="360"/>
+        <w:rPr>
+          <w:u w:val="none"/>
+        </w:rPr>
+      </w:pPr>
+      <w:r>
+        <w:rPr>
+          <w:rtl w:val="0"/>
+        </w:rPr>
+        <w:t xml:space="preserve">What languages can be used in stored procedures?</w:t>
+      </w:r>
+    </w:p>
+    <w:p>
+      <w:pPr>
+        <w:numPr>
+          <w:ilvl w:val="0"/>
+          <w:numId w:val="7"/>
+        </w:numPr>
+        <w:spacing w:after="0" w:afterAutospacing="0"/>
+        <w:ind w:left="720" w:hanging="360"/>
+        <w:rPr>
+          <w:u w:val="none"/>
+        </w:rPr>
+      </w:pPr>
+      <w:r>
+        <w:rPr>
+          <w:rtl w:val="0"/>
+        </w:rPr>
+        <w:t xml:space="preserve">How do you load nested JSON data from an API into Snowflake, and which activity is used for loading the data</w:t>
+      </w:r>
+    </w:p>
+    <w:p>
+      <w:pPr>
+        <w:numPr>
+          <w:ilvl w:val="0"/>
+          <w:numId w:val="7"/>
+        </w:numPr>
+        <w:spacing w:after="0" w:afterAutospacing="0"/>
+        <w:ind w:left="720" w:hanging="360"/>
+        <w:rPr>
+          <w:u w:val="none"/>
+        </w:rPr>
+      </w:pPr>
+      <w:r>
+        <w:rPr>
+          <w:rtl w:val="0"/>
+        </w:rPr>
+        <w:t xml:space="preserve">How do you implement SCD Type 2</w:t>
+      </w:r>
+    </w:p>
+    <w:p>
+      <w:pPr>
+        <w:numPr>
+          <w:ilvl w:val="0"/>
+          <w:numId w:val="7"/>
+        </w:numPr>
+        <w:spacing w:after="0" w:afterAutospacing="0"/>
+        <w:ind w:left="720" w:hanging="360"/>
+        <w:rPr>
+          <w:u w:val="none"/>
+        </w:rPr>
+      </w:pPr>
+      <w:r>
+        <w:rPr>
+          <w:rtl w:val="0"/>
+        </w:rPr>
+        <w:t xml:space="preserve">Scenario-based questions on SCD Type 2.</w:t>
+      </w:r>
+    </w:p>
+    <w:p>
+      <w:pPr>
+        <w:numPr>
+          <w:ilvl w:val="0"/>
+          <w:numId w:val="7"/>
+        </w:numPr>
+        <w:spacing w:after="0" w:afterAutospacing="0"/>
+        <w:ind w:left="720" w:hanging="360"/>
+        <w:rPr>
+          <w:u w:val="none"/>
+        </w:rPr>
+      </w:pPr>
+      <w:r>
+        <w:rPr>
+          <w:rtl w:val="0"/>
+        </w:rPr>
+        <w:t xml:space="preserve">What is zero copy cloning</w:t>
+      </w:r>
+    </w:p>
+    <w:p>
+      <w:pPr>
+        <w:numPr>
+          <w:ilvl w:val="0"/>
+          <w:numId w:val="7"/>
+        </w:numPr>
+        <w:spacing w:after="0" w:afterAutospacing="0"/>
+        <w:ind w:left="720" w:hanging="360"/>
+        <w:rPr>
+          <w:u w:val="none"/>
+        </w:rPr>
+      </w:pPr>
+      <w:r>
+        <w:rPr>
+          <w:rtl w:val="0"/>
+        </w:rPr>
+        <w:t xml:space="preserve">Streams and tasks</w:t>
+      </w:r>
+    </w:p>
+    <w:p>
+      <w:pPr>
+        <w:numPr>
+          <w:ilvl w:val="0"/>
+          <w:numId w:val="7"/>
+        </w:numPr>
+        <w:spacing w:after="0" w:afterAutospacing="0"/>
+        <w:ind w:left="720" w:hanging="360"/>
+        <w:rPr>
+          <w:u w:val="none"/>
+        </w:rPr>
+      </w:pPr>
+      <w:r>
+        <w:rPr>
+          <w:rtl w:val="0"/>
+        </w:rPr>
+        <w:t xml:space="preserve">What is a recursive cursor</w:t>
+      </w:r>
+    </w:p>
+    <w:p>
+      <w:pPr>
+        <w:numPr>
+          <w:ilvl w:val="0"/>
+          <w:numId w:val="7"/>
+        </w:numPr>
+        <w:ind w:left="720" w:hanging="360"/>
+        <w:rPr>
+          <w:u w:val="none"/>
+        </w:rPr>
+      </w:pPr>
+      <w:r>
+        <w:rPr>
+          <w:rtl w:val="0"/>
+        </w:rPr>
+        <w:t xml:space="preserve">Sql query to identify hard-deleted records from a table</w:t>
+      </w:r>
+    </w:p>
+    <w:p>
+      <w:pPr>
+        <w:rPr/>
+      </w:pPr>
+      <w:r>
+        <w:rPr>
+          <w:rtl w:val="0"/>
+        </w:rPr>
+      </w:r>
+    </w:p>
+    <w:p>
+      <w:pPr>
+        <w:rPr/>
+      </w:pPr>
+      <w:r>
+        <w:rPr>
+          <w:b w:val="1"/>
+          <w:rtl w:val="0"/>
+        </w:rPr>
+        <w:t xml:space="preserve">[Prasanth B]: KC Client Interview Questions</w:t>
+      </w:r>
+      <w:r>
+        <w:rPr>
+          <w:rtl w:val="0"/>
+        </w:rPr>
+      </w:r>
+    </w:p>
+    <w:p>
+      <w:pPr>
+        <w:numPr>
+          <w:ilvl w:val="0"/>
+          <w:numId w:val="2"/>
+        </w:numPr>
+        <w:spacing w:after="0" w:afterAutospacing="0"/>
+        <w:ind w:left="720" w:hanging="360"/>
+      </w:pPr>
+      <w:r>
+        <w:rPr>
+          <w:rtl w:val="0"/>
+        </w:rPr>
+        <w:t xml:space="preserve">Previous Project Landscape</w:t>
+      </w:r>
+    </w:p>
+    <w:p>
+      <w:pPr>
+        <w:numPr>
+          <w:ilvl w:val="0"/>
+          <w:numId w:val="2"/>
+        </w:numPr>
+        <w:spacing w:after="0" w:afterAutospacing="0"/>
+        <w:ind w:left="720" w:hanging="360"/>
+      </w:pPr>
+      <w:r>
+        <w:rPr>
+          <w:rtl w:val="0"/>
+        </w:rPr>
+        <w:t xml:space="preserve">How do you ingest semi structered data into snowflake</w:t>
+      </w:r>
+    </w:p>
+    <w:p>
+      <w:pPr>
+        <w:numPr>
+          <w:ilvl w:val="0"/>
+          <w:numId w:val="2"/>
+        </w:numPr>
+        <w:spacing w:after="0" w:afterAutospacing="0"/>
+        <w:ind w:left="720" w:hanging="360"/>
+      </w:pPr>
+      <w:r>
+        <w:rPr>
+          <w:rtl w:val="0"/>
+        </w:rPr>
+        <w:t xml:space="preserve">Partition Pruning</w:t>
+      </w:r>
+    </w:p>
+    <w:p>
+      <w:pPr>
+        <w:numPr>
+          <w:ilvl w:val="0"/>
+          <w:numId w:val="2"/>
+        </w:numPr>
+        <w:spacing w:after="0" w:afterAutospacing="0"/>
+        <w:ind w:left="720" w:hanging="360"/>
+      </w:pPr>
+      <w:r>
+        <w:rPr>
+          <w:rtl w:val="0"/>
+        </w:rPr>
+        <w:t xml:space="preserve">Difference between snowflake and other traditional Warehouse</w:t>
+      </w:r>
+    </w:p>
+    <w:p>
+      <w:pPr>
+        <w:numPr>
+          <w:ilvl w:val="0"/>
+          <w:numId w:val="2"/>
+        </w:numPr>
+        <w:spacing w:after="0" w:afterAutospacing="0"/>
+        <w:ind w:left="720" w:hanging="360"/>
+      </w:pPr>
+      <w:r>
+        <w:rPr>
+          <w:rtl w:val="0"/>
+        </w:rPr>
+        <w:t xml:space="preserve">Orders (order_Id, Cust_Id, Order_Date)</w:t>
+      </w:r>
+    </w:p>
+    <w:p>
+      <w:pPr>
+        <w:numPr>
+          <w:ilvl w:val="0"/>
+          <w:numId w:val="2"/>
+        </w:numPr>
+        <w:spacing w:after="0" w:afterAutospacing="0"/>
+        <w:ind w:left="720" w:hanging="360"/>
+      </w:pPr>
+      <w:r>
+        <w:rPr>
+          <w:rtl w:val="0"/>
+        </w:rPr>
+        <w:t xml:space="preserve">Customer who placed atleast 1 order per month in 2024 year.</w:t>
+      </w:r>
+    </w:p>
+    <w:p>
+      <w:pPr>
+        <w:numPr>
+          <w:ilvl w:val="0"/>
+          <w:numId w:val="2"/>
+        </w:numPr>
+        <w:spacing w:after="0" w:afterAutospacing="0"/>
+        <w:ind w:left="720" w:hanging="360"/>
+      </w:pPr>
+      <w:r>
+        <w:rPr>
+          <w:rtl w:val="0"/>
+        </w:rPr>
+        <w:t xml:space="preserve">Employees (emp_Id, emp_name, Manager_Id)</w:t>
+      </w:r>
+    </w:p>
+    <w:p>
+      <w:pPr>
+        <w:numPr>
+          <w:ilvl w:val="0"/>
+          <w:numId w:val="2"/>
+        </w:numPr>
+        <w:spacing w:after="0" w:afterAutospacing="0"/>
+        <w:ind w:left="720" w:hanging="360"/>
+      </w:pPr>
+      <w:r>
+        <w:rPr>
+          <w:rtl w:val="0"/>
+        </w:rPr>
+        <w:t xml:space="preserve">write a recursive CTE to display hierarchy from top to down.</w:t>
+      </w:r>
+    </w:p>
+    <w:p>
+      <w:pPr>
+        <w:numPr>
+          <w:ilvl w:val="0"/>
+          <w:numId w:val="2"/>
+        </w:numPr>
+        <w:spacing w:after="0" w:afterAutospacing="0"/>
+        <w:ind w:left="720" w:hanging="360"/>
+      </w:pPr>
+      <w:r>
+        <w:rPr>
+          <w:rtl w:val="0"/>
+        </w:rPr>
+        <w:t xml:space="preserve">How do you load large csv file to snowflake using ADF</w:t>
+      </w:r>
+    </w:p>
+    <w:p>
+      <w:pPr>
+        <w:numPr>
+          <w:ilvl w:val="0"/>
+          <w:numId w:val="2"/>
+        </w:numPr>
+        <w:spacing w:after="0" w:afterAutospacing="0"/>
+        <w:ind w:left="720" w:hanging="360"/>
+      </w:pPr>
+      <w:r>
+        <w:rPr>
+          <w:rtl w:val="0"/>
+        </w:rPr>
+        <w:t xml:space="preserve">How will you compress and load the file</w:t>
+      </w:r>
+    </w:p>
+    <w:p>
+      <w:pPr>
+        <w:numPr>
+          <w:ilvl w:val="0"/>
+          <w:numId w:val="2"/>
+        </w:numPr>
+        <w:spacing w:after="0" w:afterAutospacing="0"/>
+        <w:ind w:left="720" w:hanging="360"/>
+      </w:pPr>
+      <w:r>
+        <w:rPr>
+          <w:rtl w:val="0"/>
+        </w:rPr>
+        <w:t xml:space="preserve">How will identify a deleted record in snowflake production</w:t>
+      </w:r>
+    </w:p>
+    <w:p>
+      <w:pPr>
+        <w:numPr>
+          <w:ilvl w:val="0"/>
+          <w:numId w:val="2"/>
+        </w:numPr>
+        <w:ind w:left="720" w:hanging="360"/>
+        <w:rPr>
+          <w:u w:val="none"/>
+        </w:rPr>
+      </w:pPr>
+      <w:r>
+        <w:rPr>
+          <w:rtl w:val="0"/>
+        </w:rPr>
+        <w:t xml:space="preserve">Use case of Zero copy cloning</w:t>
+      </w:r>
+    </w:p>
+    <w:p>
+      <w:pPr>
+        <w:ind w:left="0" w:firstLine="0"/>
+        <w:rPr/>
+      </w:pPr>
+      <w:r>
+        <w:rPr>
+          <w:rtl w:val="0"/>
+        </w:rPr>
+      </w:r>
+    </w:p>
+    <w:p>
+      <w:pPr>
+        <w:rPr>
+          <w:b w:val="1"/>
+        </w:rPr>
+      </w:pPr>
+      <w:r>
+        <w:rPr>
+          <w:b w:val="1"/>
+          <w:rtl w:val="0"/>
+        </w:rPr>
+        <w:t xml:space="preserve">[Divya Rajendran]: KC Client Interview Questions</w:t>
+      </w:r>
+    </w:p>
+    <w:p>
+      <w:pPr>
+        <w:numPr>
+          <w:ilvl w:val="0"/>
+          <w:numId w:val="1"/>
+        </w:numPr>
+        <w:spacing w:after="0" w:afterAutospacing="0"/>
+        <w:ind w:left="720" w:hanging="360"/>
+        <w:rPr/>
+      </w:pPr>
+      <w:r>
+        <w:rPr>
+          <w:rtl w:val="0"/>
+        </w:rPr>
+        <w:t xml:space="preserve">Explain the project Architecture</w:t>
+      </w:r>
+    </w:p>
+    <w:p>
+      <w:pPr>
+        <w:numPr>
+          <w:ilvl w:val="0"/>
+          <w:numId w:val="1"/>
+        </w:numPr>
+        <w:spacing w:after="0" w:afterAutospacing="0"/>
+        <w:ind w:left="720" w:hanging="360"/>
+        <w:rPr/>
+      </w:pPr>
+      <w:r>
+        <w:rPr>
+          <w:rtl w:val="0"/>
+        </w:rPr>
+        <w:t xml:space="preserve">What are the sources used for ADF</w:t>
+      </w:r>
+    </w:p>
+    <w:p>
+      <w:pPr>
+        <w:numPr>
+          <w:ilvl w:val="0"/>
+          <w:numId w:val="1"/>
+        </w:numPr>
+        <w:spacing w:after="0" w:afterAutospacing="0"/>
+        <w:ind w:left="720" w:hanging="360"/>
+        <w:rPr>
+          <w:u w:val="none"/>
+        </w:rPr>
+      </w:pPr>
+      <w:r>
+        <w:rPr>
+          <w:rtl w:val="0"/>
+        </w:rPr>
+        <w:t xml:space="preserve">what are the information required to create linked service for snowflake</w:t>
+      </w:r>
+    </w:p>
+    <w:p>
+      <w:pPr>
+        <w:numPr>
+          <w:ilvl w:val="0"/>
+          <w:numId w:val="1"/>
+        </w:numPr>
+        <w:spacing w:after="0" w:afterAutospacing="0"/>
+        <w:ind w:left="720" w:hanging="360"/>
+        <w:rPr/>
+      </w:pPr>
+      <w:r>
+        <w:rPr>
+          <w:rtl w:val="0"/>
+        </w:rPr>
+        <w:t xml:space="preserve">How will you handle large files/sql server data</w:t>
+      </w:r>
+    </w:p>
+    <w:p>
+      <w:pPr>
+        <w:numPr>
+          <w:ilvl w:val="0"/>
+          <w:numId w:val="1"/>
+        </w:numPr>
+        <w:spacing w:after="0" w:afterAutospacing="0"/>
+        <w:ind w:left="720" w:hanging="360"/>
+      </w:pPr>
+      <w:r>
+        <w:rPr>
+          <w:rtl w:val="0"/>
+        </w:rPr>
+        <w:t xml:space="preserve">other activities you have worked apart from copy</w:t>
+      </w:r>
+    </w:p>
+    <w:p>
+      <w:pPr>
+        <w:numPr>
+          <w:ilvl w:val="0"/>
+          <w:numId w:val="1"/>
+        </w:numPr>
+        <w:spacing w:after="0" w:afterAutospacing="0"/>
+        <w:ind w:left="720" w:hanging="360"/>
+        <w:rPr>
+          <w:u w:val="none"/>
+        </w:rPr>
+      </w:pPr>
+      <w:r>
+        <w:rPr>
+          <w:rtl w:val="0"/>
+        </w:rPr>
+        <w:t xml:space="preserve">When a powerBi resource reports an issue in you data how would you backtrack</w:t>
+      </w:r>
+    </w:p>
+    <w:p>
+      <w:pPr>
+        <w:numPr>
+          <w:ilvl w:val="0"/>
+          <w:numId w:val="1"/>
+        </w:numPr>
+        <w:spacing w:after="0" w:afterAutospacing="0"/>
+        <w:ind w:left="720" w:hanging="360"/>
+        <w:rPr/>
+      </w:pPr>
+      <w:r>
+        <w:rPr>
+          <w:rtl w:val="0"/>
+        </w:rPr>
+        <w:t xml:space="preserve">How to optimize performance of snowflake</w:t>
+      </w:r>
+    </w:p>
+    <w:p>
+      <w:pPr>
+        <w:numPr>
+          <w:ilvl w:val="0"/>
+          <w:numId w:val="1"/>
+        </w:numPr>
+        <w:spacing w:after="0" w:afterAutospacing="0"/>
+        <w:ind w:left="720" w:hanging="360"/>
+        <w:rPr>
+          <w:u w:val="none"/>
+        </w:rPr>
+      </w:pPr>
+      <w:r>
+        <w:rPr>
+          <w:rtl w:val="0"/>
+        </w:rPr>
+        <w:t xml:space="preserve">Best practises to write snowflake stored procs</w:t>
+      </w:r>
+    </w:p>
+    <w:p>
+      <w:pPr>
+        <w:numPr>
+          <w:ilvl w:val="0"/>
+          <w:numId w:val="1"/>
+        </w:numPr>
+        <w:ind w:left="720" w:hanging="360"/>
+        <w:rPr>
+          <w:u w:val="none"/>
+        </w:rPr>
+      </w:pPr>
+      <w:r>
+        <w:rPr>
+          <w:rtl w:val="0"/>
+        </w:rPr>
+        <w:t xml:space="preserve">exposure to other tech stack like databricks, pyspark etc</w:t>
+      </w:r>
+    </w:p>
+    <w:p>
+      <w:pPr>
+        <w:ind w:left="720" w:firstLine="0"/>
+        <w:rPr/>
+      </w:pPr>
+      <w:r>
+        <w:rPr>
+          <w:rtl w:val="0"/>
+        </w:rPr>
+      </w:r>
+    </w:p>
+    <w:p>
+      <w:pPr>
+        <w:ind w:left="0" w:firstLine="0"/>
+        <w:rPr>
+          <w:b w:val="1"/>
+        </w:rPr>
+      </w:pPr>
+      <w:r>
+        <w:rPr>
+          <w:rtl w:val="0"/>
+        </w:rPr>
+        <w:t xml:space="preserve">[</w:t>
+      </w:r>
+      <w:r>
+        <w:rPr>
+          <w:b w:val="1"/>
+          <w:rtl w:val="0"/>
+        </w:rPr>
+        <w:t xml:space="preserve">Shubham Bhargava</w:t>
+      </w:r>
+      <w:r>
+        <w:rPr>
+          <w:rtl w:val="0"/>
+        </w:rPr>
+        <w:t xml:space="preserve">]</w:t>
+      </w:r>
+      <w:r>
+        <w:rPr>
+          <w:b w:val="1"/>
+          <w:rtl w:val="0"/>
+        </w:rPr>
+        <w:t xml:space="preserve">: KC Client Interview Questions</w:t>
+      </w:r>
+    </w:p>
+    <w:p>
+      <w:pPr>
+        <w:numPr>
+          <w:ilvl w:val="0"/>
+          <w:numId w:val="1"/>
+        </w:numPr>
+        <w:spacing w:after="0" w:afterAutospacing="0"/>
+        <w:ind w:left="720" w:hanging="360"/>
+      </w:pPr>
+      <w:r>
+        <w:rPr>
+          <w:rtl w:val="0"/>
+        </w:rPr>
+        <w:t xml:space="preserve">Explain the Snowflake projects you worked on.</w:t>
+      </w:r>
+    </w:p>
+    <w:p>
+      <w:pPr>
+        <w:numPr>
+          <w:ilvl w:val="0"/>
+          <w:numId w:val="1"/>
+        </w:numPr>
+        <w:spacing w:after="0" w:afterAutospacing="0"/>
+        <w:ind w:left="720" w:hanging="360"/>
+      </w:pPr>
+      <w:r>
+        <w:rPr>
+          <w:rtl w:val="0"/>
+        </w:rPr>
+        <w:t xml:space="preserve">You have a view in snowflake having multiple joins and data is huge, we are doing some transformations too there, testing team comes to you stating this view takes 8-9 mins to run, the coding optimizations are done in that view ,for testing perspective what other alternatives you can give to testing team to test the view?</w:t>
+      </w:r>
+    </w:p>
+    <w:p>
+      <w:pPr>
+        <w:numPr>
+          <w:ilvl w:val="0"/>
+          <w:numId w:val="1"/>
+        </w:numPr>
+        <w:spacing w:after="0" w:afterAutospacing="0"/>
+        <w:ind w:left="720" w:hanging="360"/>
+      </w:pPr>
+      <w:r>
+        <w:rPr>
+          <w:rtl w:val="0"/>
+        </w:rPr>
+        <w:t xml:space="preserve">what options u use if we want to load the data from view to a table , run this data load everyday.</w:t>
+      </w:r>
+    </w:p>
+    <w:p>
+      <w:pPr>
+        <w:numPr>
+          <w:ilvl w:val="0"/>
+          <w:numId w:val="1"/>
+        </w:numPr>
+        <w:spacing w:after="0" w:afterAutospacing="0"/>
+        <w:ind w:left="720" w:hanging="360"/>
+      </w:pPr>
+      <w:r>
+        <w:rPr>
+          <w:rtl w:val="0"/>
+        </w:rPr>
+        <w:t xml:space="preserve">implement historical changes into target, what solution will you use in this case. </w:t>
+      </w:r>
+    </w:p>
+    <w:p>
+      <w:pPr>
+        <w:numPr>
+          <w:ilvl w:val="0"/>
+          <w:numId w:val="1"/>
+        </w:numPr>
+        <w:spacing w:after="0" w:afterAutospacing="0"/>
+        <w:ind w:left="720" w:hanging="360"/>
+      </w:pPr>
+      <w:r>
+        <w:rPr>
+          <w:rtl w:val="0"/>
+        </w:rPr>
+        <w:t xml:space="preserve">Default number of partitions that snowflake creates on its own.</w:t>
+      </w:r>
+    </w:p>
+    <w:p>
+      <w:pPr>
+        <w:numPr>
+          <w:ilvl w:val="0"/>
+          <w:numId w:val="1"/>
+        </w:numPr>
+        <w:spacing w:after="0" w:afterAutospacing="0"/>
+        <w:ind w:left="720" w:hanging="360"/>
+      </w:pPr>
+      <w:r>
+        <w:rPr>
+          <w:rtl w:val="0"/>
+        </w:rPr>
+        <w:t xml:space="preserve">How will you figure out what is the optimal number of partitions in your query profile.</w:t>
+      </w:r>
+    </w:p>
+    <w:p>
+      <w:pPr>
+        <w:numPr>
+          <w:ilvl w:val="0"/>
+          <w:numId w:val="1"/>
+        </w:numPr>
+        <w:spacing w:after="0" w:afterAutospacing="0"/>
+        <w:ind w:left="720" w:hanging="360"/>
+      </w:pPr>
+      <w:r>
+        <w:rPr>
+          <w:rtl w:val="0"/>
+        </w:rPr>
+        <w:t xml:space="preserve">In which scenarios we have disk spills?</w:t>
+      </w:r>
+    </w:p>
+    <w:p>
+      <w:pPr>
+        <w:numPr>
+          <w:ilvl w:val="0"/>
+          <w:numId w:val="1"/>
+        </w:numPr>
+        <w:spacing w:after="0" w:afterAutospacing="0"/>
+        <w:ind w:left="720" w:hanging="360"/>
+      </w:pPr>
+      <w:r>
+        <w:rPr>
+          <w:rtl w:val="0"/>
+        </w:rPr>
+        <w:t xml:space="preserve">How will you transfer code from one environment to another?</w:t>
+      </w:r>
+    </w:p>
+    <w:p>
+      <w:pPr>
+        <w:numPr>
+          <w:ilvl w:val="0"/>
+          <w:numId w:val="1"/>
+        </w:numPr>
+        <w:ind w:left="720" w:hanging="360"/>
+      </w:pPr>
+      <w:r>
+        <w:rPr>
+          <w:rtl w:val="0"/>
+        </w:rPr>
+        <w:t xml:space="preserve">Business analyst says the data in source system is not matching with target system(Snowflake), how will you guide the BA to proceed with the testing?</w:t>
+      </w:r>
+    </w:p>
+    <w:p>
+      <w:pPr>
+        <w:rPr/>
+      </w:pPr>
+      <w:r>
+        <w:rPr>
+          <w:rtl w:val="0"/>
+        </w:rPr>
+      </w:r>
+    </w:p>
+    <w:p>
+      <w:pPr>
+        <w:rPr>
+          <w:b w:val="1"/>
+        </w:rPr>
+      </w:pPr>
+      <w:r>
+        <w:rPr>
+          <w:b w:val="1"/>
+          <w:rtl w:val="0"/>
+        </w:rPr>
+        <w:t xml:space="preserve">[Vijay Manikanta] : KC Client Interview Questions</w:t>
+      </w:r>
+    </w:p>
+    <w:p>
+      <w:pPr>
+        <w:numPr>
+          <w:ilvl w:val="0"/>
+          <w:numId w:val="4"/>
+        </w:numPr>
+        <w:spacing w:after="0" w:afterAutospacing="0" w:before="240" w:lineRule="auto"/>
+        <w:ind w:left="720" w:hanging="360"/>
+        <w:rPr/>
+      </w:pPr>
+      <w:r>
+        <w:rPr>
+          <w:rtl w:val="0"/>
+        </w:rPr>
+        <w:t xml:space="preserve">Intro and snowflake exp in different projects.</w:t>
+      </w:r>
+    </w:p>
+    <w:p>
+      <w:pPr>
+        <w:numPr>
+          <w:ilvl w:val="0"/>
+          <w:numId w:val="4"/>
+        </w:numPr>
+        <w:spacing w:after="0" w:afterAutospacing="0" w:before="0" w:beforeAutospacing="0" w:lineRule="auto"/>
+        <w:ind w:left="720" w:hanging="360"/>
+        <w:rPr/>
+      </w:pPr>
+      <w:r>
+        <w:rPr>
+          <w:rtl w:val="0"/>
+        </w:rPr>
+        <w:t xml:space="preserve">Project explanation end to end (current)</w:t>
+      </w:r>
+    </w:p>
+    <w:p>
+      <w:pPr>
+        <w:numPr>
+          <w:ilvl w:val="0"/>
+          <w:numId w:val="4"/>
+        </w:numPr>
+        <w:spacing w:after="0" w:afterAutospacing="0" w:before="0" w:beforeAutospacing="0" w:lineRule="auto"/>
+        <w:ind w:left="720" w:hanging="360"/>
+        <w:rPr/>
+      </w:pPr>
+      <w:r>
+        <w:rPr>
+          <w:rtl w:val="0"/>
+        </w:rPr>
+        <w:t xml:space="preserve">The major issue which you fixed in snowflake.</w:t>
+      </w:r>
+    </w:p>
+    <w:p>
+      <w:pPr>
+        <w:numPr>
+          <w:ilvl w:val="0"/>
+          <w:numId w:val="4"/>
+        </w:numPr>
+        <w:spacing w:after="0" w:afterAutospacing="0" w:before="0" w:beforeAutospacing="0" w:lineRule="auto"/>
+        <w:ind w:left="720" w:hanging="360"/>
+        <w:rPr/>
+      </w:pPr>
+      <w:r>
+        <w:rPr>
+          <w:rtl w:val="0"/>
+        </w:rPr>
+        <w:t xml:space="preserve">Zero copy cloning in snowflake.</w:t>
+      </w:r>
+    </w:p>
+    <w:p>
+      <w:pPr>
+        <w:numPr>
+          <w:ilvl w:val="0"/>
+          <w:numId w:val="4"/>
+        </w:numPr>
+        <w:spacing w:after="0" w:afterAutospacing="0" w:before="0" w:beforeAutospacing="0" w:lineRule="auto"/>
+        <w:ind w:left="720" w:hanging="360"/>
+        <w:rPr/>
+      </w:pPr>
+      <w:r>
+        <w:rPr>
+          <w:rtl w:val="0"/>
+        </w:rPr>
+        <w:t xml:space="preserve">HOW to load unstructured or semi structured data into snowflake.</w:t>
+      </w:r>
+    </w:p>
+    <w:p>
+      <w:pPr>
+        <w:numPr>
+          <w:ilvl w:val="0"/>
+          <w:numId w:val="4"/>
+        </w:numPr>
+        <w:spacing w:after="0" w:afterAutospacing="0" w:before="0" w:beforeAutospacing="0" w:lineRule="auto"/>
+        <w:ind w:left="720" w:hanging="360"/>
+        <w:rPr/>
+      </w:pPr>
+      <w:r>
+        <w:rPr>
+          <w:rtl w:val="0"/>
+        </w:rPr>
+        <w:t xml:space="preserve">What type of semi structured data loaded to snowflake db.</w:t>
+      </w:r>
+    </w:p>
+    <w:p>
+      <w:pPr>
+        <w:numPr>
+          <w:ilvl w:val="0"/>
+          <w:numId w:val="4"/>
+        </w:numPr>
+        <w:spacing w:after="0" w:afterAutospacing="0" w:before="0" w:beforeAutospacing="0" w:lineRule="auto"/>
+        <w:ind w:left="720" w:hanging="360"/>
+        <w:rPr/>
+      </w:pPr>
+      <w:r>
+        <w:rPr>
+          <w:rtl w:val="0"/>
+        </w:rPr>
+        <w:t xml:space="preserve">Implementation of SCD TYPE 2 in snowflake?</w:t>
+      </w:r>
+    </w:p>
+    <w:p>
+      <w:pPr>
+        <w:numPr>
+          <w:ilvl w:val="0"/>
+          <w:numId w:val="4"/>
+        </w:numPr>
+        <w:spacing w:after="0" w:afterAutospacing="0" w:before="0" w:beforeAutospacing="0" w:lineRule="auto"/>
+        <w:ind w:left="720" w:hanging="360"/>
+        <w:rPr/>
+      </w:pPr>
+      <w:r>
+        <w:rPr>
+          <w:rtl w:val="0"/>
+        </w:rPr>
+        <w:t xml:space="preserve">Why we need to use streams, cant we implement the scd type 2 normally?</w:t>
+      </w:r>
+    </w:p>
+    <w:p>
+      <w:pPr>
+        <w:numPr>
+          <w:ilvl w:val="0"/>
+          <w:numId w:val="4"/>
+        </w:numPr>
+        <w:spacing w:after="0" w:afterAutospacing="0" w:before="0" w:beforeAutospacing="0" w:lineRule="auto"/>
+        <w:ind w:left="720" w:hanging="360"/>
+        <w:rPr/>
+      </w:pPr>
+      <w:r>
+        <w:rPr>
+          <w:rtl w:val="0"/>
+        </w:rPr>
+        <w:t xml:space="preserve">When do we usually go for stream?</w:t>
+      </w:r>
+    </w:p>
+    <w:p>
+      <w:pPr>
+        <w:numPr>
+          <w:ilvl w:val="0"/>
+          <w:numId w:val="4"/>
+        </w:numPr>
+        <w:spacing w:after="0" w:afterAutospacing="0" w:before="0" w:beforeAutospacing="0" w:lineRule="auto"/>
+        <w:ind w:left="720" w:hanging="360"/>
+        <w:rPr/>
+      </w:pPr>
+      <w:r>
+        <w:rPr>
+          <w:rtl w:val="0"/>
+        </w:rPr>
+        <w:t xml:space="preserve">Difference between stream and task? </w:t>
+      </w:r>
+    </w:p>
+    <w:p>
+      <w:pPr>
+        <w:numPr>
+          <w:ilvl w:val="0"/>
+          <w:numId w:val="4"/>
+        </w:numPr>
+        <w:spacing w:after="0" w:afterAutospacing="0" w:before="0" w:beforeAutospacing="0" w:lineRule="auto"/>
+        <w:ind w:left="720" w:hanging="360"/>
+        <w:rPr/>
+      </w:pPr>
+      <w:r>
+        <w:rPr>
+          <w:rtl w:val="0"/>
+        </w:rPr>
+        <w:t xml:space="preserve">What is your life cycle landscape ? CI/CD related.</w:t>
+      </w:r>
+    </w:p>
+    <w:p>
+      <w:pPr>
+        <w:numPr>
+          <w:ilvl w:val="0"/>
+          <w:numId w:val="4"/>
+        </w:numPr>
+        <w:spacing w:after="0" w:afterAutospacing="0" w:before="0" w:beforeAutospacing="0" w:lineRule="auto"/>
+        <w:ind w:left="720" w:hanging="360"/>
+        <w:rPr/>
+      </w:pPr>
+      <w:r>
+        <w:rPr>
+          <w:rtl w:val="0"/>
+        </w:rPr>
+        <w:t xml:space="preserve">Using github can we move the code or ddl from one to another env through github.</w:t>
+      </w:r>
+    </w:p>
+    <w:p>
+      <w:pPr>
+        <w:numPr>
+          <w:ilvl w:val="0"/>
+          <w:numId w:val="4"/>
+        </w:numPr>
+        <w:spacing w:after="0" w:afterAutospacing="0" w:before="0" w:beforeAutospacing="0" w:lineRule="auto"/>
+        <w:ind w:left="720" w:hanging="360"/>
+        <w:rPr/>
+      </w:pPr>
+      <w:r>
+        <w:rPr>
+          <w:rtl w:val="0"/>
+        </w:rPr>
+        <w:t xml:space="preserve">Why multiple layers in loading the data from source to target. (Project related Question).</w:t>
+      </w:r>
+    </w:p>
+    <w:p>
+      <w:pPr>
+        <w:numPr>
+          <w:ilvl w:val="0"/>
+          <w:numId w:val="4"/>
+        </w:numPr>
+        <w:spacing w:after="0" w:afterAutospacing="0" w:before="0" w:beforeAutospacing="0" w:lineRule="auto"/>
+        <w:ind w:left="720" w:hanging="360"/>
+        <w:rPr/>
+      </w:pPr>
+      <w:r>
+        <w:rPr>
+          <w:rtl w:val="0"/>
+        </w:rPr>
+        <w:t xml:space="preserve">How to fetch incremental data from source?</w:t>
+      </w:r>
+    </w:p>
+    <w:p>
+      <w:pPr>
+        <w:numPr>
+          <w:ilvl w:val="0"/>
+          <w:numId w:val="4"/>
+        </w:numPr>
+        <w:spacing w:after="0" w:afterAutospacing="0" w:before="0" w:beforeAutospacing="0" w:lineRule="auto"/>
+        <w:ind w:left="720" w:hanging="360"/>
+        <w:rPr/>
+      </w:pPr>
+      <w:r>
+        <w:rPr>
+          <w:rtl w:val="0"/>
+        </w:rPr>
+        <w:t xml:space="preserve">How to avoid data gaps incase if any failures in data pipeline?</w:t>
+      </w:r>
+    </w:p>
+    <w:p>
+      <w:pPr>
+        <w:numPr>
+          <w:ilvl w:val="0"/>
+          <w:numId w:val="4"/>
+        </w:numPr>
+        <w:spacing w:after="0" w:afterAutospacing="0" w:before="0" w:beforeAutospacing="0" w:lineRule="auto"/>
+        <w:ind w:left="720" w:hanging="360"/>
+        <w:rPr/>
+      </w:pPr>
+      <w:r>
+        <w:rPr>
+          <w:rtl w:val="0"/>
+        </w:rPr>
+        <w:t xml:space="preserve">Partitions based questions. Auto scaling and its impact in cluster size.</w:t>
+      </w:r>
+    </w:p>
+    <w:p>
+      <w:pPr>
+        <w:numPr>
+          <w:ilvl w:val="0"/>
+          <w:numId w:val="4"/>
+        </w:numPr>
+        <w:spacing w:after="0" w:afterAutospacing="0" w:before="0" w:beforeAutospacing="0" w:lineRule="auto"/>
+        <w:ind w:left="720" w:hanging="360"/>
+        <w:rPr/>
+      </w:pPr>
+      <w:r>
+        <w:rPr>
+          <w:rtl w:val="0"/>
+        </w:rPr>
+        <w:t xml:space="preserve">Is it possible to change the warehouse size dynamically.?</w:t>
+      </w:r>
+    </w:p>
+    <w:p>
+      <w:pPr>
+        <w:numPr>
+          <w:ilvl w:val="0"/>
+          <w:numId w:val="4"/>
+        </w:numPr>
+        <w:spacing w:after="0" w:afterAutospacing="0" w:before="0" w:beforeAutospacing="0" w:lineRule="auto"/>
+        <w:ind w:left="720" w:hanging="360"/>
+        <w:rPr/>
+      </w:pPr>
+      <w:r>
+        <w:rPr>
+          <w:rtl w:val="0"/>
+        </w:rPr>
+        <w:t xml:space="preserve">In snowflake for 30 days its executing for 10 secs and suddenly it started long running for almost 5 mins?</w:t>
+      </w:r>
+    </w:p>
+    <w:p>
+      <w:pPr>
+        <w:numPr>
+          <w:ilvl w:val="0"/>
+          <w:numId w:val="4"/>
+        </w:numPr>
+        <w:spacing w:after="0" w:afterAutospacing="0" w:before="0" w:beforeAutospacing="0" w:lineRule="auto"/>
+        <w:ind w:left="720" w:hanging="360"/>
+        <w:rPr/>
+      </w:pPr>
+      <w:r>
+        <w:rPr>
+          <w:rtl w:val="0"/>
+        </w:rPr>
+        <w:t xml:space="preserve">Before creating the cluster keys what are the factors we need to consider?</w:t>
+      </w:r>
+    </w:p>
+    <w:p>
+      <w:pPr>
+        <w:numPr>
+          <w:ilvl w:val="0"/>
+          <w:numId w:val="4"/>
+        </w:numPr>
+        <w:spacing w:after="0" w:afterAutospacing="0" w:before="0" w:beforeAutospacing="0" w:lineRule="auto"/>
+        <w:ind w:left="720" w:hanging="360"/>
+        <w:rPr/>
+      </w:pPr>
+      <w:r>
+        <w:rPr>
+          <w:rtl w:val="0"/>
+        </w:rPr>
+        <w:t xml:space="preserve">SQL &amp; stored procedures self rating out of 5?</w:t>
+      </w:r>
+    </w:p>
+    <w:p>
+      <w:pPr>
+        <w:numPr>
+          <w:ilvl w:val="0"/>
+          <w:numId w:val="4"/>
+        </w:numPr>
+        <w:spacing w:after="0" w:afterAutospacing="0" w:before="0" w:beforeAutospacing="0" w:lineRule="auto"/>
+        <w:ind w:left="720" w:hanging="360"/>
+        <w:rPr/>
+      </w:pPr>
+      <w:r>
+        <w:rPr>
+          <w:rtl w:val="0"/>
+        </w:rPr>
+        <w:t xml:space="preserve">Who are all the customers who placed atleast one order in a month in 2024 from Order table.</w:t>
+      </w:r>
+    </w:p>
+    <w:p>
+      <w:pPr>
+        <w:numPr>
+          <w:ilvl w:val="0"/>
+          <w:numId w:val="4"/>
+        </w:numPr>
+        <w:spacing w:after="0" w:afterAutospacing="0" w:before="0" w:beforeAutospacing="0" w:lineRule="auto"/>
+        <w:ind w:left="720" w:hanging="360"/>
+        <w:rPr/>
+      </w:pPr>
+      <w:r>
+        <w:rPr>
+          <w:rtl w:val="0"/>
+        </w:rPr>
+        <w:t xml:space="preserve">Order id column is an autoincremental, Hard deleted happened in that table randomly. How to find out what are the missing ids.Expected to write a SQL Query.</w:t>
+      </w:r>
+    </w:p>
+    <w:p>
+      <w:pPr>
+        <w:numPr>
+          <w:ilvl w:val="0"/>
+          <w:numId w:val="4"/>
+        </w:numPr>
+        <w:spacing w:after="0" w:afterAutospacing="0" w:before="0" w:beforeAutospacing="0" w:lineRule="auto"/>
+        <w:ind w:left="720" w:hanging="360"/>
+        <w:rPr/>
+      </w:pPr>
+      <w:r>
+        <w:rPr>
+          <w:rtl w:val="0"/>
+        </w:rPr>
+        <w:t xml:space="preserve">Order id is alpha numeric (varchar). I have some alpha numeric data in that particular column, could you write a SQL query to find only the alphanumeric values.(RegEXP function).</w:t>
+      </w:r>
+    </w:p>
+    <w:p>
+      <w:pPr>
+        <w:numPr>
+          <w:ilvl w:val="0"/>
+          <w:numId w:val="4"/>
+        </w:numPr>
+        <w:spacing w:after="0" w:afterAutospacing="0" w:before="0" w:beforeAutospacing="0" w:lineRule="auto"/>
+        <w:ind w:left="720" w:hanging="360"/>
+        <w:rPr/>
+      </w:pPr>
+      <w:r>
+        <w:rPr>
+          <w:rtl w:val="0"/>
+        </w:rPr>
+        <w:t xml:space="preserve">How to Iterate of particular data sets (result datasets) in stored procedure.</w:t>
+      </w:r>
+    </w:p>
+    <w:p>
+      <w:pPr>
+        <w:numPr>
+          <w:ilvl w:val="0"/>
+          <w:numId w:val="4"/>
+        </w:numPr>
+        <w:spacing w:after="0" w:afterAutospacing="0" w:before="0" w:beforeAutospacing="0" w:lineRule="auto"/>
+        <w:ind w:left="720" w:hanging="360"/>
+        <w:rPr/>
+      </w:pPr>
+      <w:r>
+        <w:rPr>
+          <w:rtl w:val="0"/>
+        </w:rPr>
+        <w:t xml:space="preserve">what is the main difference between cursor and While in stored procedure?</w:t>
+      </w:r>
+    </w:p>
+    <w:p>
+      <w:pPr>
+        <w:numPr>
+          <w:ilvl w:val="0"/>
+          <w:numId w:val="4"/>
+        </w:numPr>
+        <w:spacing w:after="0" w:afterAutospacing="0" w:before="0" w:beforeAutospacing="0" w:lineRule="auto"/>
+        <w:ind w:left="720" w:hanging="360"/>
+        <w:rPr/>
+      </w:pPr>
+      <w:r>
+        <w:rPr>
+          <w:rtl w:val="0"/>
+        </w:rPr>
+        <w:t xml:space="preserve">Exception handling in snowflake?</w:t>
+      </w:r>
+    </w:p>
+    <w:p>
+      <w:pPr>
+        <w:numPr>
+          <w:ilvl w:val="0"/>
+          <w:numId w:val="4"/>
+        </w:numPr>
+        <w:spacing w:after="240" w:before="0" w:beforeAutospacing="0" w:lineRule="auto"/>
+        <w:ind w:left="720" w:hanging="360"/>
+        <w:rPr/>
+      </w:pPr>
+      <w:r>
+        <w:rPr>
+          <w:rtl w:val="0"/>
+        </w:rPr>
+        <w:t xml:space="preserve">Wrapper procedure where 4-5 procedures are called internally. How to set the dependency among them? If one of them fails the other also should fail.(the design should be in such a way that it handles this dependency).</w:t>
+      </w:r>
+    </w:p>
+    <w:p>
+      <w:pPr>
+        <w:rPr>
+          <w:b w:val="1"/>
+        </w:rPr>
+      </w:pPr>
+      <w:r>
+        <w:rPr>
+          <w:rtl w:val="0"/>
+        </w:rPr>
+      </w:r>
+    </w:p>
+    <w:p>
+      <w:pPr>
+        <w:rPr/>
+      </w:pPr>
+      <w:r>
+        <w:rPr>
+          <w:rtl w:val="0"/>
+        </w:rPr>
+      </w:r>
+    </w:p>
+    <w:p>
+      <w:pPr>
+        <w:rPr>
+          <w:b w:val="1"/>
+        </w:rPr>
       </w:pPr>
       <w:r>
         <w:rPr>
@@ -1113,6 +2708,446 @@
   <w:abstractNum w:abstractNumId="1">
     <w:lvl w:ilvl="0">
       <w:start w:val="1"/>
+      <w:numFmt w:val="bullet"/>
+      <w:lvlText w:val="●"/>
+      <w:lvlJc w:val="left"/>
+      <w:pPr>
+        <w:ind w:left="720" w:hanging="360"/>
+      </w:pPr>
+      <w:rPr>
+        <w:u w:val="none"/>
+      </w:rPr>
+    </w:lvl>
+    <w:lvl w:ilvl="1">
+      <w:start w:val="1"/>
+      <w:numFmt w:val="bullet"/>
+      <w:lvlText w:val="○"/>
+      <w:lvlJc w:val="left"/>
+      <w:pPr>
+        <w:ind w:left="1440" w:hanging="360"/>
+      </w:pPr>
+      <w:rPr>
+        <w:u w:val="none"/>
+      </w:rPr>
+    </w:lvl>
+    <w:lvl w:ilvl="2">
+      <w:start w:val="1"/>
+      <w:numFmt w:val="bullet"/>
+      <w:lvlText w:val="■"/>
+      <w:lvlJc w:val="left"/>
+      <w:pPr>
+        <w:ind w:left="2160" w:hanging="360"/>
+      </w:pPr>
+      <w:rPr>
+        <w:u w:val="none"/>
+      </w:rPr>
+    </w:lvl>
+    <w:lvl w:ilvl="3">
+      <w:start w:val="1"/>
+      <w:numFmt w:val="bullet"/>
+      <w:lvlText w:val="●"/>
+      <w:lvlJc w:val="left"/>
+      <w:pPr>
+        <w:ind w:left="2880" w:hanging="360"/>
+      </w:pPr>
+      <w:rPr>
+        <w:u w:val="none"/>
+      </w:rPr>
+    </w:lvl>
+    <w:lvl w:ilvl="4">
+      <w:start w:val="1"/>
+      <w:numFmt w:val="bullet"/>
+      <w:lvlText w:val="○"/>
+      <w:lvlJc w:val="left"/>
+      <w:pPr>
+        <w:ind w:left="3600" w:hanging="360"/>
+      </w:pPr>
+      <w:rPr>
+        <w:u w:val="none"/>
+      </w:rPr>
+    </w:lvl>
+    <w:lvl w:ilvl="5">
+      <w:start w:val="1"/>
+      <w:numFmt w:val="bullet"/>
+      <w:lvlText w:val="■"/>
+      <w:lvlJc w:val="left"/>
+      <w:pPr>
+        <w:ind w:left="4320" w:hanging="360"/>
+      </w:pPr>
+      <w:rPr>
+        <w:u w:val="none"/>
+      </w:rPr>
+    </w:lvl>
+    <w:lvl w:ilvl="6">
+      <w:start w:val="1"/>
+      <w:numFmt w:val="bullet"/>
+      <w:lvlText w:val="●"/>
+      <w:lvlJc w:val="left"/>
+      <w:pPr>
+        <w:ind w:left="5040" w:hanging="360"/>
+      </w:pPr>
+      <w:rPr>
+        <w:u w:val="none"/>
+      </w:rPr>
+    </w:lvl>
+    <w:lvl w:ilvl="7">
+      <w:start w:val="1"/>
+      <w:numFmt w:val="bullet"/>
+      <w:lvlText w:val="○"/>
+      <w:lvlJc w:val="left"/>
+      <w:pPr>
+        <w:ind w:left="5760" w:hanging="360"/>
+      </w:pPr>
+      <w:rPr>
+        <w:u w:val="none"/>
+      </w:rPr>
+    </w:lvl>
+    <w:lvl w:ilvl="8">
+      <w:start w:val="1"/>
+      <w:numFmt w:val="bullet"/>
+      <w:lvlText w:val="■"/>
+      <w:lvlJc w:val="left"/>
+      <w:pPr>
+        <w:ind w:left="6480" w:hanging="360"/>
+      </w:pPr>
+      <w:rPr>
+        <w:u w:val="none"/>
+      </w:rPr>
+    </w:lvl>
+  </w:abstractNum>
+  <w:abstractNum w:abstractNumId="2">
+    <w:lvl w:ilvl="0">
+      <w:start w:val="1"/>
+      <w:numFmt w:val="bullet"/>
+      <w:lvlText w:val="●"/>
+      <w:lvlJc w:val="left"/>
+      <w:pPr>
+        <w:ind w:left="720" w:hanging="360"/>
+      </w:pPr>
+      <w:rPr>
+        <w:u w:val="none"/>
+      </w:rPr>
+    </w:lvl>
+    <w:lvl w:ilvl="1">
+      <w:start w:val="1"/>
+      <w:numFmt w:val="bullet"/>
+      <w:lvlText w:val="○"/>
+      <w:lvlJc w:val="left"/>
+      <w:pPr>
+        <w:ind w:left="1440" w:hanging="360"/>
+      </w:pPr>
+      <w:rPr>
+        <w:u w:val="none"/>
+      </w:rPr>
+    </w:lvl>
+    <w:lvl w:ilvl="2">
+      <w:start w:val="1"/>
+      <w:numFmt w:val="bullet"/>
+      <w:lvlText w:val="■"/>
+      <w:lvlJc w:val="left"/>
+      <w:pPr>
+        <w:ind w:left="2160" w:hanging="360"/>
+      </w:pPr>
+      <w:rPr>
+        <w:u w:val="none"/>
+      </w:rPr>
+    </w:lvl>
+    <w:lvl w:ilvl="3">
+      <w:start w:val="1"/>
+      <w:numFmt w:val="bullet"/>
+      <w:lvlText w:val="●"/>
+      <w:lvlJc w:val="left"/>
+      <w:pPr>
+        <w:ind w:left="2880" w:hanging="360"/>
+      </w:pPr>
+      <w:rPr>
+        <w:u w:val="none"/>
+      </w:rPr>
+    </w:lvl>
+    <w:lvl w:ilvl="4">
+      <w:start w:val="1"/>
+      <w:numFmt w:val="bullet"/>
+      <w:lvlText w:val="○"/>
+      <w:lvlJc w:val="left"/>
+      <w:pPr>
+        <w:ind w:left="3600" w:hanging="360"/>
+      </w:pPr>
+      <w:rPr>
+        <w:u w:val="none"/>
+      </w:rPr>
+    </w:lvl>
+    <w:lvl w:ilvl="5">
+      <w:start w:val="1"/>
+      <w:numFmt w:val="bullet"/>
+      <w:lvlText w:val="■"/>
+      <w:lvlJc w:val="left"/>
+      <w:pPr>
+        <w:ind w:left="4320" w:hanging="360"/>
+      </w:pPr>
+      <w:rPr>
+        <w:u w:val="none"/>
+      </w:rPr>
+    </w:lvl>
+    <w:lvl w:ilvl="6">
+      <w:start w:val="1"/>
+      <w:numFmt w:val="bullet"/>
+      <w:lvlText w:val="●"/>
+      <w:lvlJc w:val="left"/>
+      <w:pPr>
+        <w:ind w:left="5040" w:hanging="360"/>
+      </w:pPr>
+      <w:rPr>
+        <w:u w:val="none"/>
+      </w:rPr>
+    </w:lvl>
+    <w:lvl w:ilvl="7">
+      <w:start w:val="1"/>
+      <w:numFmt w:val="bullet"/>
+      <w:lvlText w:val="○"/>
+      <w:lvlJc w:val="left"/>
+      <w:pPr>
+        <w:ind w:left="5760" w:hanging="360"/>
+      </w:pPr>
+      <w:rPr>
+        <w:u w:val="none"/>
+      </w:rPr>
+    </w:lvl>
+    <w:lvl w:ilvl="8">
+      <w:start w:val="1"/>
+      <w:numFmt w:val="bullet"/>
+      <w:lvlText w:val="■"/>
+      <w:lvlJc w:val="left"/>
+      <w:pPr>
+        <w:ind w:left="6480" w:hanging="360"/>
+      </w:pPr>
+      <w:rPr>
+        <w:u w:val="none"/>
+      </w:rPr>
+    </w:lvl>
+  </w:abstractNum>
+  <w:abstractNum w:abstractNumId="3">
+    <w:lvl w:ilvl="0">
+      <w:start w:val="1"/>
+      <w:numFmt w:val="decimal"/>
+      <w:lvlText w:val="%1."/>
+      <w:lvlJc w:val="left"/>
+      <w:pPr>
+        <w:ind w:left="720" w:hanging="360"/>
+      </w:pPr>
+      <w:rPr>
+        <w:u w:val="none"/>
+      </w:rPr>
+    </w:lvl>
+    <w:lvl w:ilvl="1">
+      <w:start w:val="1"/>
+      <w:numFmt w:val="lowerLetter"/>
+      <w:lvlText w:val="%2."/>
+      <w:lvlJc w:val="left"/>
+      <w:pPr>
+        <w:ind w:left="1440" w:hanging="360"/>
+      </w:pPr>
+      <w:rPr>
+        <w:u w:val="none"/>
+      </w:rPr>
+    </w:lvl>
+    <w:lvl w:ilvl="2">
+      <w:start w:val="1"/>
+      <w:numFmt w:val="lowerRoman"/>
+      <w:lvlText w:val="%3."/>
+      <w:lvlJc w:val="right"/>
+      <w:pPr>
+        <w:ind w:left="2160" w:hanging="360"/>
+      </w:pPr>
+      <w:rPr>
+        <w:u w:val="none"/>
+      </w:rPr>
+    </w:lvl>
+    <w:lvl w:ilvl="3">
+      <w:start w:val="1"/>
+      <w:numFmt w:val="decimal"/>
+      <w:lvlText w:val="%4."/>
+      <w:lvlJc w:val="left"/>
+      <w:pPr>
+        <w:ind w:left="2880" w:hanging="360"/>
+      </w:pPr>
+      <w:rPr>
+        <w:u w:val="none"/>
+      </w:rPr>
+    </w:lvl>
+    <w:lvl w:ilvl="4">
+      <w:start w:val="1"/>
+      <w:numFmt w:val="lowerLetter"/>
+      <w:lvlText w:val="%5."/>
+      <w:lvlJc w:val="left"/>
+      <w:pPr>
+        <w:ind w:left="3600" w:hanging="360"/>
+      </w:pPr>
+      <w:rPr>
+        <w:u w:val="none"/>
+      </w:rPr>
+    </w:lvl>
+    <w:lvl w:ilvl="5">
+      <w:start w:val="1"/>
+      <w:numFmt w:val="lowerRoman"/>
+      <w:lvlText w:val="%6."/>
+      <w:lvlJc w:val="right"/>
+      <w:pPr>
+        <w:ind w:left="4320" w:hanging="360"/>
+      </w:pPr>
+      <w:rPr>
+        <w:u w:val="none"/>
+      </w:rPr>
+    </w:lvl>
+    <w:lvl w:ilvl="6">
+      <w:start w:val="1"/>
+      <w:numFmt w:val="decimal"/>
+      <w:lvlText w:val="%7."/>
+      <w:lvlJc w:val="left"/>
+      <w:pPr>
+        <w:ind w:left="5040" w:hanging="360"/>
+      </w:pPr>
+      <w:rPr>
+        <w:u w:val="none"/>
+      </w:rPr>
+    </w:lvl>
+    <w:lvl w:ilvl="7">
+      <w:start w:val="1"/>
+      <w:numFmt w:val="lowerLetter"/>
+      <w:lvlText w:val="%8."/>
+      <w:lvlJc w:val="left"/>
+      <w:pPr>
+        <w:ind w:left="5760" w:hanging="360"/>
+      </w:pPr>
+      <w:rPr>
+        <w:u w:val="none"/>
+      </w:rPr>
+    </w:lvl>
+    <w:lvl w:ilvl="8">
+      <w:start w:val="1"/>
+      <w:numFmt w:val="lowerRoman"/>
+      <w:lvlText w:val="%9."/>
+      <w:lvlJc w:val="right"/>
+      <w:pPr>
+        <w:ind w:left="6480" w:hanging="360"/>
+      </w:pPr>
+      <w:rPr>
+        <w:u w:val="none"/>
+      </w:rPr>
+    </w:lvl>
+  </w:abstractNum>
+  <w:abstractNum w:abstractNumId="4">
+    <w:lvl w:ilvl="0">
+      <w:start w:val="1"/>
+      <w:numFmt w:val="bullet"/>
+      <w:lvlText w:val="●"/>
+      <w:lvlJc w:val="left"/>
+      <w:pPr>
+        <w:ind w:left="720" w:hanging="360"/>
+      </w:pPr>
+      <w:rPr>
+        <w:u w:val="none"/>
+      </w:rPr>
+    </w:lvl>
+    <w:lvl w:ilvl="1">
+      <w:start w:val="1"/>
+      <w:numFmt w:val="bullet"/>
+      <w:lvlText w:val="○"/>
+      <w:lvlJc w:val="left"/>
+      <w:pPr>
+        <w:ind w:left="1440" w:hanging="360"/>
+      </w:pPr>
+      <w:rPr>
+        <w:u w:val="none"/>
+      </w:rPr>
+    </w:lvl>
+    <w:lvl w:ilvl="2">
+      <w:start w:val="1"/>
+      <w:numFmt w:val="bullet"/>
+      <w:lvlText w:val="■"/>
+      <w:lvlJc w:val="left"/>
+      <w:pPr>
+        <w:ind w:left="2160" w:hanging="360"/>
+      </w:pPr>
+      <w:rPr>
+        <w:u w:val="none"/>
+      </w:rPr>
+    </w:lvl>
+    <w:lvl w:ilvl="3">
+      <w:start w:val="1"/>
+      <w:numFmt w:val="bullet"/>
+      <w:lvlText w:val="●"/>
+      <w:lvlJc w:val="left"/>
+      <w:pPr>
+        <w:ind w:left="2880" w:hanging="360"/>
+      </w:pPr>
+      <w:rPr>
+        <w:u w:val="none"/>
+      </w:rPr>
+    </w:lvl>
+    <w:lvl w:ilvl="4">
+      <w:start w:val="1"/>
+      <w:numFmt w:val="bullet"/>
+      <w:lvlText w:val="○"/>
+      <w:lvlJc w:val="left"/>
+      <w:pPr>
+        <w:ind w:left="3600" w:hanging="360"/>
+      </w:pPr>
+      <w:rPr>
+        <w:u w:val="none"/>
+      </w:rPr>
+    </w:lvl>
+    <w:lvl w:ilvl="5">
+      <w:start w:val="1"/>
+      <w:numFmt w:val="bullet"/>
+      <w:lvlText w:val="■"/>
+      <w:lvlJc w:val="left"/>
+      <w:pPr>
+        <w:ind w:left="4320" w:hanging="360"/>
+      </w:pPr>
+      <w:rPr>
+        <w:u w:val="none"/>
+      </w:rPr>
+    </w:lvl>
+    <w:lvl w:ilvl="6">
+      <w:start w:val="1"/>
+      <w:numFmt w:val="bullet"/>
+      <w:lvlText w:val="●"/>
+      <w:lvlJc w:val="left"/>
+      <w:pPr>
+        <w:ind w:left="5040" w:hanging="360"/>
+      </w:pPr>
+      <w:rPr>
+        <w:u w:val="none"/>
+      </w:rPr>
+    </w:lvl>
+    <w:lvl w:ilvl="7">
+      <w:start w:val="1"/>
+      <w:numFmt w:val="bullet"/>
+      <w:lvlText w:val="○"/>
+      <w:lvlJc w:val="left"/>
+      <w:pPr>
+        <w:ind w:left="5760" w:hanging="360"/>
+      </w:pPr>
+      <w:rPr>
+        <w:u w:val="none"/>
+      </w:rPr>
+    </w:lvl>
+    <w:lvl w:ilvl="8">
+      <w:start w:val="1"/>
+      <w:numFmt w:val="bullet"/>
+      <w:lvlText w:val="■"/>
+      <w:lvlJc w:val="left"/>
+      <w:pPr>
+        <w:ind w:left="6480" w:hanging="360"/>
+      </w:pPr>
+      <w:rPr>
+        <w:u w:val="none"/>
+      </w:rPr>
+    </w:lvl>
+  </w:abstractNum>
+  <w:abstractNum w:abstractNumId="5">
+    <w:lvl w:ilvl="0">
+      <w:start w:val="1"/>
       <w:numFmt w:val="decimal"/>
       <w:lvlText w:val="%1."/>
       <w:lvlJc w:val="left"/>
@@ -1206,7 +3241,7 @@
       <w:rPr/>
     </w:lvl>
   </w:abstractNum>
-  <w:abstractNum w:abstractNumId="2">
+  <w:abstractNum w:abstractNumId="6">
     <w:lvl w:ilvl="0">
       <w:start w:val="1"/>
       <w:numFmt w:val="decimal"/>
@@ -1300,6 +3335,116 @@
         <w:ind w:left="6480" w:hanging="360"/>
       </w:pPr>
       <w:rPr/>
+    </w:lvl>
+  </w:abstractNum>
+  <w:abstractNum w:abstractNumId="7">
+    <w:lvl w:ilvl="0">
+      <w:start w:val="1"/>
+      <w:numFmt w:val="bullet"/>
+      <w:lvlText w:val="●"/>
+      <w:lvlJc w:val="left"/>
+      <w:pPr>
+        <w:ind w:left="720" w:hanging="360"/>
+      </w:pPr>
+      <w:rPr>
+        <w:u w:val="none"/>
+      </w:rPr>
+    </w:lvl>
+    <w:lvl w:ilvl="1">
+      <w:start w:val="1"/>
+      <w:numFmt w:val="bullet"/>
+      <w:lvlText w:val="○"/>
+      <w:lvlJc w:val="left"/>
+      <w:pPr>
+        <w:ind w:left="1440" w:hanging="360"/>
+      </w:pPr>
+      <w:rPr>
+        <w:u w:val="none"/>
+      </w:rPr>
+    </w:lvl>
+    <w:lvl w:ilvl="2">
+      <w:start w:val="1"/>
+      <w:numFmt w:val="bullet"/>
+      <w:lvlText w:val="■"/>
+      <w:lvlJc w:val="left"/>
+      <w:pPr>
+        <w:ind w:left="2160" w:hanging="360"/>
+      </w:pPr>
+      <w:rPr>
+        <w:u w:val="none"/>
+      </w:rPr>
+    </w:lvl>
+    <w:lvl w:ilvl="3">
+      <w:start w:val="1"/>
+      <w:numFmt w:val="bullet"/>
+      <w:lvlText w:val="●"/>
+      <w:lvlJc w:val="left"/>
+      <w:pPr>
+        <w:ind w:left="2880" w:hanging="360"/>
+      </w:pPr>
+      <w:rPr>
+        <w:u w:val="none"/>
+      </w:rPr>
+    </w:lvl>
+    <w:lvl w:ilvl="4">
+      <w:start w:val="1"/>
+      <w:numFmt w:val="bullet"/>
+      <w:lvlText w:val="○"/>
+      <w:lvlJc w:val="left"/>
+      <w:pPr>
+        <w:ind w:left="3600" w:hanging="360"/>
+      </w:pPr>
+      <w:rPr>
+        <w:u w:val="none"/>
+      </w:rPr>
+    </w:lvl>
+    <w:lvl w:ilvl="5">
+      <w:start w:val="1"/>
+      <w:numFmt w:val="bullet"/>
+      <w:lvlText w:val="■"/>
+      <w:lvlJc w:val="left"/>
+      <w:pPr>
+        <w:ind w:left="4320" w:hanging="360"/>
+      </w:pPr>
+      <w:rPr>
+        <w:u w:val="none"/>
+      </w:rPr>
+    </w:lvl>
+    <w:lvl w:ilvl="6">
+      <w:start w:val="1"/>
+      <w:numFmt w:val="bullet"/>
+      <w:lvlText w:val="●"/>
+      <w:lvlJc w:val="left"/>
+      <w:pPr>
+        <w:ind w:left="5040" w:hanging="360"/>
+      </w:pPr>
+      <w:rPr>
+        <w:u w:val="none"/>
+      </w:rPr>
+    </w:lvl>
+    <w:lvl w:ilvl="7">
+      <w:start w:val="1"/>
+      <w:numFmt w:val="bullet"/>
+      <w:lvlText w:val="○"/>
+      <w:lvlJc w:val="left"/>
+      <w:pPr>
+        <w:ind w:left="5760" w:hanging="360"/>
+      </w:pPr>
+      <w:rPr>
+        <w:u w:val="none"/>
+      </w:rPr>
+    </w:lvl>
+    <w:lvl w:ilvl="8">
+      <w:start w:val="1"/>
+      <w:numFmt w:val="bullet"/>
+      <w:lvlText w:val="■"/>
+      <w:lvlJc w:val="left"/>
+      <w:pPr>
+        <w:ind w:left="6480" w:hanging="360"/>
+      </w:pPr>
+      <w:rPr>
+        <w:u w:val="none"/>
+      </w:rPr>
     </w:lvl>
   </w:abstractNum>
   <w:num w:numId="1">
@@ -1307,6 +3452,21 @@
   </w:num>
   <w:num w:numId="2">
     <w:abstractNumId w:val="2"/>
+  </w:num>
+  <w:num w:numId="3">
+    <w:abstractNumId w:val="3"/>
+  </w:num>
+  <w:num w:numId="4">
+    <w:abstractNumId w:val="4"/>
+  </w:num>
+  <w:num w:numId="5">
+    <w:abstractNumId w:val="5"/>
+  </w:num>
+  <w:num w:numId="6">
+    <w:abstractNumId w:val="6"/>
+  </w:num>
+  <w:num w:numId="7">
+    <w:abstractNumId w:val="7"/>
   </w:num>
 </w:numbering>
 </file>
@@ -1328,11 +3488,19 @@
       </w:pPr>
     </w:pPrDefault>
   </w:docDefaults>
+  <w:style w:type="table" w:styleId="TableNormal" w:default="1">
+    <w:name w:val="TableNormal"/>
+    <w:tblPr>
+      <w:tblCellMar>
+        <w:top w:w="100.0" w:type="dxa"/>
+        <w:left w:w="100.0" w:type="dxa"/>
+        <w:bottom w:w="100.0" w:type="dxa"/>
+        <w:right w:w="100.0" w:type="dxa"/>
+      </w:tblCellMar>
+    </w:tblPr>
+  </w:style>
   <w:style w:type="paragraph" w:styleId="Normal" w:default="1">
     <w:name w:val="normal"/>
-  </w:style>
-  <w:style w:type="table" w:styleId="TableNormal" w:default="1">
-    <w:name w:val="TableNormal"/>
   </w:style>
   <w:style w:type="paragraph" w:styleId="Heading1">
     <w:name w:val="heading 1"/>

</xml_diff>